<commit_message>
feat: link account permissions to routing templates
</commit_message>
<xml_diff>
--- a/public/template-import-mapping-guide.docx
+++ b/public/template-import-mapping-guide.docx
@@ -3,9 +3,6 @@
 <w:document xmlns:wpc="http://schemas.microsoft.com/office/word/2010/wordprocessingCanvas" xmlns:mo="http://schemas.microsoft.com/office/mac/office/2008/main" xmlns:mc="http://schemas.openxmlformats.org/markup-compatibility/2006" xmlns:mv="urn:schemas-microsoft-com:mac:vml" xmlns:o="urn:schemas-microsoft-com:office:office" xmlns:r="http://schemas.openxmlformats.org/officeDocument/2006/relationships" xmlns:m="http://schemas.openxmlformats.org/officeDocument/2006/math" xmlns:v="urn:schemas-microsoft-com:vml" xmlns:wp14="http://schemas.microsoft.com/office/word/2010/wordprocessingDrawing" xmlns:wp="http://schemas.openxmlformats.org/drawingml/2006/wordprocessingDrawing" xmlns:w10="urn:schemas-microsoft-com:office:word" xmlns:w="http://schemas.openxmlformats.org/wordprocessingml/2006/main" xmlns:w14="http://schemas.microsoft.com/office/word/2010/wordml" xmlns:wpg="http://schemas.microsoft.com/office/word/2010/wordprocessingGroup" xmlns:wpi="http://schemas.microsoft.com/office/word/2010/wordprocessingInk" xmlns:wne="http://schemas.microsoft.com/office/word/2006/wordml" xmlns:wps="http://schemas.microsoft.com/office/word/2010/wordprocessingShape" mc:Ignorable="w14 wp14">
   <w:body>
     <w:p>
-      <w:pPr>
-        <w:spacing w:after="80"/>
-      </w:pPr>
       <w:r>
         <w:rPr>
           <w:rFonts w:ascii="Calibri" w:hAnsi="Calibri" w:eastAsia="Microsoft YaHei"/>
@@ -25,14 +22,14 @@
           <w:rFonts w:ascii="Calibri" w:hAnsi="Calibri" w:eastAsia="Microsoft YaHei"/>
           <w:b/>
           <w:color w:val="17365D"/>
-          <w:sz w:val="48"/>
+          <w:sz w:val="46"/>
         </w:rPr>
-        <w:t>报单排序模板导入映射规则</w:t>
+        <w:t>开户报单排序模板映射规则</w:t>
       </w:r>
     </w:p>
     <w:p>
       <w:pPr>
-        <w:spacing w:after="280"/>
+        <w:spacing w:after="200"/>
       </w:pPr>
       <w:r>
         <w:rPr>
@@ -41,7 +38,7 @@
           <w:color w:val="667085"/>
           <w:sz w:val="21"/>
         </w:rPr>
-        <w:t>适用于 OMS 交易账户开户配置中的“模板导入”功能｜版本 1.0</w:t>
+        <w:t>页面只保留模板下拉框；完整对应关系以本文件为准</w:t>
       </w:r>
     </w:p>
     <w:p>
@@ -49,7 +46,7 @@
         <w:pStyle w:val="Heading1"/>
       </w:pPr>
       <w:r>
-        <w:t>1. 使用方法</w:t>
+        <w:t>1. 填写方式</w:t>
       </w:r>
     </w:p>
     <w:p>
@@ -63,7 +60,7 @@
           <w:color w:val="1F4D78"/>
           <w:sz w:val="22"/>
         </w:rPr>
-        <w:t>选择模板：</w:t>
+        <w:t>权限生成：</w:t>
       </w:r>
       <w:r>
         <w:rPr>
@@ -72,7 +69,7 @@
           <w:color w:val="000000"/>
           <w:sz w:val="22"/>
         </w:rPr>
-        <w:t>在开户页面的报单排序配置中点击“模板导入”，选择需要引用的报单排序模板。</w:t>
+        <w:t>上方每开通一个“市场×品种”，下方自动生成一行，市场和品种不可单独修改。</w:t>
       </w:r>
     </w:p>
     <w:p>
@@ -86,7 +83,7 @@
           <w:color w:val="1F4D78"/>
           <w:sz w:val="22"/>
         </w:rPr>
-        <w:t>查看结果：</w:t>
+        <w:t>模板引用：</w:t>
       </w:r>
       <w:r>
         <w:rPr>
@@ -95,7 +92,7 @@
           <w:color w:val="000000"/>
           <w:sz w:val="22"/>
         </w:rPr>
-        <w:t>系统根据下表映射关系及当前账户交易权限，显示全部匹配、部分匹配或无法导入。</w:t>
+        <w:t>从“模板导入”下拉框选择既有报单排序模板，系统逐行匹配并填充。</w:t>
       </w:r>
     </w:p>
     <w:p>
@@ -109,7 +106,7 @@
           <w:color w:val="1F4D78"/>
           <w:sz w:val="22"/>
         </w:rPr>
-        <w:t>确认导入：</w:t>
+        <w:t>缺项处理：</w:t>
       </w:r>
       <w:r>
         <w:rPr>
@@ -118,7 +115,7 @@
           <w:color w:val="000000"/>
           <w:sz w:val="22"/>
         </w:rPr>
-        <w:t>仅匹配规则会写入当前开户编辑状态；最终以开户页面的确定/保存结果为准。</w:t>
+        <w:t>模板中没有对应市场×品种时，报单排序模板与交易方向均留空，需手工完成。</w:t>
       </w:r>
     </w:p>
     <w:p>
@@ -126,7 +123,7 @@
         <w:pStyle w:val="Heading1"/>
       </w:pPr>
       <w:r>
-        <w:t>2. 市场与交易所映射</w:t>
+        <w:t>2. tradingMarket 码表</w:t>
       </w:r>
     </w:p>
     <w:tbl>
@@ -138,9 +135,10 @@
         <w:tblInd w:w="120" w:type="dxa"/>
       </w:tblPr>
       <w:tblGrid>
-        <w:gridCol w:w="1850"/>
-        <w:gridCol w:w="4700"/>
-        <w:gridCol w:w="2810"/>
+        <w:gridCol w:w="1600"/>
+        <w:gridCol w:w="2300"/>
+        <w:gridCol w:w="2700"/>
+        <w:gridCol w:w="2760"/>
       </w:tblGrid>
       <w:tr>
         <w:trPr>
@@ -148,7 +146,7 @@
         </w:trPr>
         <w:tc>
           <w:tcPr>
-            <w:tcW w:type="dxa" w:w="1850"/>
+            <w:tcW w:type="dxa" w:w="1600"/>
             <w:shd w:fill="E8EEF5"/>
             <w:vAlign w:val="center"/>
             <w:tcMar>
@@ -169,13 +167,13 @@
                 <w:color w:val="1F4D78"/>
                 <w:sz w:val="19"/>
               </w:rPr>
-              <w:t>开户股票市场</w:t>
+              <w:t>开户页面显示</w:t>
             </w:r>
           </w:p>
         </w:tc>
         <w:tc>
           <w:tcPr>
-            <w:tcW w:type="dxa" w:w="4700"/>
+            <w:tcW w:type="dxa" w:w="2300"/>
             <w:shd w:fill="E8EEF5"/>
             <w:vAlign w:val="center"/>
             <w:tcMar>
@@ -196,13 +194,13 @@
                 <w:color w:val="1F4D78"/>
                 <w:sz w:val="19"/>
               </w:rPr>
-              <w:t>模板中的交易所</w:t>
+              <w:t>后端码值 codeValue</w:t>
             </w:r>
           </w:p>
         </w:tc>
         <w:tc>
           <w:tcPr>
-            <w:tcW w:type="dxa" w:w="2810"/>
+            <w:tcW w:type="dxa" w:w="2700"/>
             <w:shd w:fill="E8EEF5"/>
             <w:vAlign w:val="center"/>
             <w:tcMar>
@@ -223,7 +221,34 @@
                 <w:color w:val="1F4D78"/>
                 <w:sz w:val="19"/>
               </w:rPr>
-              <w:t>生成规则</w:t>
+              <w:t>模板市场标签</w:t>
+            </w:r>
+          </w:p>
+        </w:tc>
+        <w:tc>
+          <w:tcPr>
+            <w:tcW w:type="dxa" w:w="2760"/>
+            <w:shd w:fill="E8EEF5"/>
+            <w:vAlign w:val="center"/>
+            <w:tcMar>
+              <w:top w:w="80" w:type="dxa"/>
+              <w:start w:w="120" w:type="dxa"/>
+              <w:bottom w:w="80" w:type="dxa"/>
+              <w:end w:w="120" w:type="dxa"/>
+            </w:tcMar>
+          </w:tcPr>
+          <w:p>
+            <w:pPr>
+              <w:spacing w:after="0" w:line="240" w:lineRule="auto"/>
+            </w:pPr>
+            <w:r>
+              <w:rPr>
+                <w:rFonts w:ascii="Calibri" w:hAnsi="Calibri" w:eastAsia="Microsoft YaHei"/>
+                <w:b/>
+                <w:color w:val="1F4D78"/>
+                <w:sz w:val="19"/>
+              </w:rPr>
+              <w:t>用途</w:t>
             </w:r>
           </w:p>
         </w:tc>
@@ -231,7 +256,7 @@
       <w:tr>
         <w:tc>
           <w:tcPr>
-            <w:tcW w:type="dxa" w:w="1850"/>
+            <w:tcW w:type="dxa" w:w="1600"/>
             <w:vAlign w:val="center"/>
             <w:tcMar>
               <w:top w:w="80" w:type="dxa"/>
@@ -257,7 +282,7 @@
         </w:tc>
         <w:tc>
           <w:tcPr>
-            <w:tcW w:type="dxa" w:w="4700"/>
+            <w:tcW w:type="dxa" w:w="2300"/>
             <w:vAlign w:val="center"/>
             <w:tcMar>
               <w:top w:w="80" w:type="dxa"/>
@@ -277,13 +302,13 @@
                 <w:color w:val="000000"/>
                 <w:sz w:val="19"/>
               </w:rPr>
-              <w:t>上交所、深交所</w:t>
+              <w:t>A股</w:t>
             </w:r>
           </w:p>
         </w:tc>
         <w:tc>
           <w:tcPr>
-            <w:tcW w:type="dxa" w:w="2810"/>
+            <w:tcW w:type="dxa" w:w="2700"/>
             <w:vAlign w:val="center"/>
             <w:tcMar>
               <w:top w:w="80" w:type="dxa"/>
@@ -303,7 +328,33 @@
                 <w:color w:val="000000"/>
                 <w:sz w:val="19"/>
               </w:rPr>
-              <w:t>生成沪深市场规则</w:t>
+              <w:t>SH、SZ、SHC、SZC</w:t>
+            </w:r>
+          </w:p>
+        </w:tc>
+        <w:tc>
+          <w:tcPr>
+            <w:tcW w:type="dxa" w:w="2760"/>
+            <w:vAlign w:val="center"/>
+            <w:tcMar>
+              <w:top w:w="80" w:type="dxa"/>
+              <w:start w:w="120" w:type="dxa"/>
+              <w:bottom w:w="80" w:type="dxa"/>
+              <w:end w:w="120" w:type="dxa"/>
+            </w:tcMar>
+          </w:tcPr>
+          <w:p>
+            <w:pPr>
+              <w:spacing w:after="0" w:line="264" w:lineRule="auto"/>
+            </w:pPr>
+            <w:r>
+              <w:rPr>
+                <w:rFonts w:ascii="Calibri" w:hAnsi="Calibri" w:eastAsia="Microsoft YaHei"/>
+                <w:b w:val="0"/>
+                <w:color w:val="000000"/>
+                <w:sz w:val="19"/>
+              </w:rPr>
+              <w:t>保存提交 A股；用标签匹配模板交易所</w:t>
             </w:r>
           </w:p>
         </w:tc>
@@ -311,7 +362,7 @@
       <w:tr>
         <w:tc>
           <w:tcPr>
-            <w:tcW w:type="dxa" w:w="1850"/>
+            <w:tcW w:type="dxa" w:w="1600"/>
             <w:vAlign w:val="center"/>
             <w:tcMar>
               <w:top w:w="80" w:type="dxa"/>
@@ -337,7 +388,7 @@
         </w:tc>
         <w:tc>
           <w:tcPr>
-            <w:tcW w:type="dxa" w:w="4700"/>
+            <w:tcW w:type="dxa" w:w="2300"/>
             <w:vAlign w:val="center"/>
             <w:tcMar>
               <w:top w:w="80" w:type="dxa"/>
@@ -357,13 +408,13 @@
                 <w:color w:val="000000"/>
                 <w:sz w:val="19"/>
               </w:rPr>
-              <w:t>香港交易所、深港通、沪股通</w:t>
+              <w:t>港股</w:t>
             </w:r>
           </w:p>
         </w:tc>
         <w:tc>
           <w:tcPr>
-            <w:tcW w:type="dxa" w:w="2810"/>
+            <w:tcW w:type="dxa" w:w="2700"/>
             <w:vAlign w:val="center"/>
             <w:tcMar>
               <w:top w:w="80" w:type="dxa"/>
@@ -383,7 +434,33 @@
                 <w:color w:val="000000"/>
                 <w:sz w:val="19"/>
               </w:rPr>
-              <w:t>生成港股市场规则</w:t>
+              <w:t>HZ、HS、HK</w:t>
+            </w:r>
+          </w:p>
+        </w:tc>
+        <w:tc>
+          <w:tcPr>
+            <w:tcW w:type="dxa" w:w="2760"/>
+            <w:vAlign w:val="center"/>
+            <w:tcMar>
+              <w:top w:w="80" w:type="dxa"/>
+              <w:start w:w="120" w:type="dxa"/>
+              <w:bottom w:w="80" w:type="dxa"/>
+              <w:end w:w="120" w:type="dxa"/>
+            </w:tcMar>
+          </w:tcPr>
+          <w:p>
+            <w:pPr>
+              <w:spacing w:after="0" w:line="264" w:lineRule="auto"/>
+            </w:pPr>
+            <w:r>
+              <w:rPr>
+                <w:rFonts w:ascii="Calibri" w:hAnsi="Calibri" w:eastAsia="Microsoft YaHei"/>
+                <w:b w:val="0"/>
+                <w:color w:val="000000"/>
+                <w:sz w:val="19"/>
+              </w:rPr>
+              <w:t>保存提交 港股；用标签匹配模板交易所</w:t>
             </w:r>
           </w:p>
         </w:tc>
@@ -391,7 +468,7 @@
       <w:tr>
         <w:tc>
           <w:tcPr>
-            <w:tcW w:type="dxa" w:w="1850"/>
+            <w:tcW w:type="dxa" w:w="1600"/>
             <w:vAlign w:val="center"/>
             <w:tcMar>
               <w:top w:w="80" w:type="dxa"/>
@@ -417,7 +494,7 @@
         </w:tc>
         <w:tc>
           <w:tcPr>
-            <w:tcW w:type="dxa" w:w="4700"/>
+            <w:tcW w:type="dxa" w:w="2300"/>
             <w:vAlign w:val="center"/>
             <w:tcMar>
               <w:top w:w="80" w:type="dxa"/>
@@ -437,13 +514,13 @@
                 <w:color w:val="000000"/>
                 <w:sz w:val="19"/>
               </w:rPr>
-              <w:t>美国证券交易所、纽约证券交易所</w:t>
+              <w:t>美股</w:t>
             </w:r>
           </w:p>
         </w:tc>
         <w:tc>
           <w:tcPr>
-            <w:tcW w:type="dxa" w:w="2810"/>
+            <w:tcW w:type="dxa" w:w="2700"/>
             <w:vAlign w:val="center"/>
             <w:tcMar>
               <w:top w:w="80" w:type="dxa"/>
@@ -463,7 +540,33 @@
                 <w:color w:val="000000"/>
                 <w:sz w:val="19"/>
               </w:rPr>
-              <w:t>生成美股市场规则</w:t>
+              <w:t>N、A、O</w:t>
+            </w:r>
+          </w:p>
+        </w:tc>
+        <w:tc>
+          <w:tcPr>
+            <w:tcW w:type="dxa" w:w="2760"/>
+            <w:vAlign w:val="center"/>
+            <w:tcMar>
+              <w:top w:w="80" w:type="dxa"/>
+              <w:start w:w="120" w:type="dxa"/>
+              <w:bottom w:w="80" w:type="dxa"/>
+              <w:end w:w="120" w:type="dxa"/>
+            </w:tcMar>
+          </w:tcPr>
+          <w:p>
+            <w:pPr>
+              <w:spacing w:after="0" w:line="264" w:lineRule="auto"/>
+            </w:pPr>
+            <w:r>
+              <w:rPr>
+                <w:rFonts w:ascii="Calibri" w:hAnsi="Calibri" w:eastAsia="Microsoft YaHei"/>
+                <w:b w:val="0"/>
+                <w:color w:val="000000"/>
+                <w:sz w:val="19"/>
+              </w:rPr>
+              <w:t>保存提交 美股；用标签匹配模板交易所</w:t>
             </w:r>
           </w:p>
         </w:tc>
@@ -479,7 +582,7 @@
         <w:pStyle w:val="Heading1"/>
       </w:pPr>
       <w:r>
-        <w:t>3. 品种与合约类型映射</w:t>
+        <w:t>3. 品种与合约类型</w:t>
       </w:r>
     </w:p>
     <w:tbl>
@@ -492,8 +595,8 @@
       </w:tblPr>
       <w:tblGrid>
         <w:gridCol w:w="1850"/>
-        <w:gridCol w:w="3550"/>
-        <w:gridCol w:w="3960"/>
+        <w:gridCol w:w="3300"/>
+        <w:gridCol w:w="4210"/>
       </w:tblGrid>
       <w:tr>
         <w:trPr>
@@ -528,7 +631,7 @@
         </w:tc>
         <w:tc>
           <w:tcPr>
-            <w:tcW w:type="dxa" w:w="3550"/>
+            <w:tcW w:type="dxa" w:w="3300"/>
             <w:shd w:fill="E8EEF5"/>
             <w:vAlign w:val="center"/>
             <w:tcMar>
@@ -549,13 +652,13 @@
                 <w:color w:val="1F4D78"/>
                 <w:sz w:val="19"/>
               </w:rPr>
-              <w:t>模板中的合约类型</w:t>
+              <w:t>模板合约类型</w:t>
             </w:r>
           </w:p>
         </w:tc>
         <w:tc>
           <w:tcPr>
-            <w:tcW w:type="dxa" w:w="3960"/>
+            <w:tcW w:type="dxa" w:w="4210"/>
             <w:shd w:fill="E8EEF5"/>
             <w:vAlign w:val="center"/>
             <w:tcMar>
@@ -576,7 +679,7 @@
                 <w:color w:val="1F4D78"/>
                 <w:sz w:val="19"/>
               </w:rPr>
-              <w:t>处理结果</w:t>
+              <w:t>匹配结果</w:t>
             </w:r>
           </w:p>
         </w:tc>
@@ -610,7 +713,7 @@
         </w:tc>
         <w:tc>
           <w:tcPr>
-            <w:tcW w:type="dxa" w:w="3550"/>
+            <w:tcW w:type="dxa" w:w="3300"/>
             <w:vAlign w:val="center"/>
             <w:tcMar>
               <w:top w:w="80" w:type="dxa"/>
@@ -636,7 +739,7 @@
         </w:tc>
         <w:tc>
           <w:tcPr>
-            <w:tcW w:type="dxa" w:w="3960"/>
+            <w:tcW w:type="dxa" w:w="4210"/>
             <w:vAlign w:val="center"/>
             <w:tcMar>
               <w:top w:w="80" w:type="dxa"/>
@@ -656,7 +759,7 @@
                 <w:color w:val="000000"/>
                 <w:sz w:val="19"/>
               </w:rPr>
-              <w:t>按股票品种校验权限</w:t>
+              <w:t>可用于对应市场的股票行</w:t>
             </w:r>
           </w:p>
         </w:tc>
@@ -690,7 +793,7 @@
         </w:tc>
         <w:tc>
           <w:tcPr>
-            <w:tcW w:type="dxa" w:w="3550"/>
+            <w:tcW w:type="dxa" w:w="3300"/>
             <w:vAlign w:val="center"/>
             <w:tcMar>
               <w:top w:w="80" w:type="dxa"/>
@@ -716,7 +819,7 @@
         </w:tc>
         <w:tc>
           <w:tcPr>
-            <w:tcW w:type="dxa" w:w="3960"/>
+            <w:tcW w:type="dxa" w:w="4210"/>
             <w:vAlign w:val="center"/>
             <w:tcMar>
               <w:top w:w="80" w:type="dxa"/>
@@ -736,7 +839,7 @@
                 <w:color w:val="000000"/>
                 <w:sz w:val="19"/>
               </w:rPr>
-              <w:t>按 ETF 品种校验权限</w:t>
+              <w:t>可用于对应市场的 ETF 行</w:t>
             </w:r>
           </w:p>
         </w:tc>
@@ -770,7 +873,7 @@
         </w:tc>
         <w:tc>
           <w:tcPr>
-            <w:tcW w:type="dxa" w:w="3550"/>
+            <w:tcW w:type="dxa" w:w="3300"/>
             <w:vAlign w:val="center"/>
             <w:tcMar>
               <w:top w:w="80" w:type="dxa"/>
@@ -796,7 +899,7 @@
         </w:tc>
         <w:tc>
           <w:tcPr>
-            <w:tcW w:type="dxa" w:w="3960"/>
+            <w:tcW w:type="dxa" w:w="4210"/>
             <w:vAlign w:val="center"/>
             <w:tcMar>
               <w:top w:w="80" w:type="dxa"/>
@@ -816,7 +919,7 @@
                 <w:color w:val="000000"/>
                 <w:sz w:val="19"/>
               </w:rPr>
-              <w:t>按可转债品种校验权限</w:t>
+              <w:t>可用于对应市场的可转债行</w:t>
             </w:r>
           </w:p>
         </w:tc>
@@ -828,11 +931,16 @@
       </w:pPr>
     </w:p>
     <w:p>
+      <w:r>
+        <w:br w:type="page"/>
+      </w:r>
+    </w:p>
+    <w:p>
       <w:pPr>
         <w:pStyle w:val="Heading1"/>
       </w:pPr>
       <w:r>
-        <w:t>4. 交易方向映射</w:t>
+        <w:t>4. 方向与匹配顺序</w:t>
       </w:r>
     </w:p>
     <w:tbl>
@@ -844,9 +952,8 @@
         <w:tblInd w:w="120" w:type="dxa"/>
       </w:tblPr>
       <w:tblGrid>
-        <w:gridCol w:w="1850"/>
-        <w:gridCol w:w="3550"/>
-        <w:gridCol w:w="3960"/>
+        <w:gridCol w:w="2300"/>
+        <w:gridCol w:w="7060"/>
       </w:tblGrid>
       <w:tr>
         <w:trPr>
@@ -854,7 +961,7 @@
         </w:trPr>
         <w:tc>
           <w:tcPr>
-            <w:tcW w:type="dxa" w:w="1850"/>
+            <w:tcW w:type="dxa" w:w="2300"/>
             <w:shd w:fill="E8EEF5"/>
             <w:vAlign w:val="center"/>
             <w:tcMar>
@@ -875,13 +982,13 @@
                 <w:color w:val="1F4D78"/>
                 <w:sz w:val="19"/>
               </w:rPr>
-              <w:t>开户交易方向</w:t>
+              <w:t>规则</w:t>
             </w:r>
           </w:p>
         </w:tc>
         <w:tc>
           <w:tcPr>
-            <w:tcW w:type="dxa" w:w="3550"/>
+            <w:tcW w:type="dxa" w:w="7060"/>
             <w:shd w:fill="E8EEF5"/>
             <w:vAlign w:val="center"/>
             <w:tcMar>
@@ -902,13 +1009,315 @@
                 <w:color w:val="1F4D78"/>
                 <w:sz w:val="19"/>
               </w:rPr>
-              <w:t>模板中的交易方向</w:t>
+              <w:t>处理</w:t>
+            </w:r>
+          </w:p>
+        </w:tc>
+      </w:tr>
+      <w:tr>
+        <w:tc>
+          <w:tcPr>
+            <w:tcW w:type="dxa" w:w="2300"/>
+            <w:vAlign w:val="center"/>
+            <w:tcMar>
+              <w:top w:w="80" w:type="dxa"/>
+              <w:start w:w="120" w:type="dxa"/>
+              <w:bottom w:w="80" w:type="dxa"/>
+              <w:end w:w="120" w:type="dxa"/>
+            </w:tcMar>
+          </w:tcPr>
+          <w:p>
+            <w:pPr>
+              <w:spacing w:after="0" w:line="264" w:lineRule="auto"/>
+            </w:pPr>
+            <w:r>
+              <w:rPr>
+                <w:rFonts w:ascii="Calibri" w:hAnsi="Calibri" w:eastAsia="Microsoft YaHei"/>
+                <w:b w:val="0"/>
+                <w:color w:val="000000"/>
+                <w:sz w:val="19"/>
+              </w:rPr>
+              <w:t>方向归一化</w:t>
             </w:r>
           </w:p>
         </w:tc>
         <w:tc>
           <w:tcPr>
-            <w:tcW w:type="dxa" w:w="3960"/>
+            <w:tcW w:type="dxa" w:w="7060"/>
+            <w:vAlign w:val="center"/>
+            <w:tcMar>
+              <w:top w:w="80" w:type="dxa"/>
+              <w:start w:w="120" w:type="dxa"/>
+              <w:bottom w:w="80" w:type="dxa"/>
+              <w:end w:w="120" w:type="dxa"/>
+            </w:tcMar>
+          </w:tcPr>
+          <w:p>
+            <w:pPr>
+              <w:spacing w:after="0" w:line="264" w:lineRule="auto"/>
+            </w:pPr>
+            <w:r>
+              <w:rPr>
+                <w:rFonts w:ascii="Calibri" w:hAnsi="Calibri" w:eastAsia="Microsoft YaHei"/>
+                <w:b w:val="0"/>
+                <w:color w:val="000000"/>
+                <w:sz w:val="19"/>
+              </w:rPr>
+              <w:t>买入、买开统一为买；卖出、卖平统一为卖</w:t>
+            </w:r>
+          </w:p>
+        </w:tc>
+      </w:tr>
+      <w:tr>
+        <w:tc>
+          <w:tcPr>
+            <w:tcW w:type="dxa" w:w="2300"/>
+            <w:vAlign w:val="center"/>
+            <w:tcMar>
+              <w:top w:w="80" w:type="dxa"/>
+              <w:start w:w="120" w:type="dxa"/>
+              <w:bottom w:w="80" w:type="dxa"/>
+              <w:end w:w="120" w:type="dxa"/>
+            </w:tcMar>
+          </w:tcPr>
+          <w:p>
+            <w:pPr>
+              <w:spacing w:after="0" w:line="264" w:lineRule="auto"/>
+            </w:pPr>
+            <w:r>
+              <w:rPr>
+                <w:rFonts w:ascii="Calibri" w:hAnsi="Calibri" w:eastAsia="Microsoft YaHei"/>
+                <w:b w:val="0"/>
+                <w:color w:val="000000"/>
+                <w:sz w:val="19"/>
+              </w:rPr>
+              <w:t>市场匹配</w:t>
+            </w:r>
+          </w:p>
+        </w:tc>
+        <w:tc>
+          <w:tcPr>
+            <w:tcW w:type="dxa" w:w="7060"/>
+            <w:vAlign w:val="center"/>
+            <w:tcMar>
+              <w:top w:w="80" w:type="dxa"/>
+              <w:start w:w="120" w:type="dxa"/>
+              <w:bottom w:w="80" w:type="dxa"/>
+              <w:end w:w="120" w:type="dxa"/>
+            </w:tcMar>
+          </w:tcPr>
+          <w:p>
+            <w:pPr>
+              <w:spacing w:after="0" w:line="264" w:lineRule="auto"/>
+            </w:pPr>
+            <w:r>
+              <w:rPr>
+                <w:rFonts w:ascii="Calibri" w:hAnsi="Calibri" w:eastAsia="Microsoft YaHei"/>
+                <w:b w:val="0"/>
+                <w:color w:val="000000"/>
+                <w:sz w:val="19"/>
+              </w:rPr>
+              <w:t>模板行任一市场标签命中该页面市场的标签集合</w:t>
+            </w:r>
+          </w:p>
+        </w:tc>
+      </w:tr>
+      <w:tr>
+        <w:tc>
+          <w:tcPr>
+            <w:tcW w:type="dxa" w:w="2300"/>
+            <w:vAlign w:val="center"/>
+            <w:tcMar>
+              <w:top w:w="80" w:type="dxa"/>
+              <w:start w:w="120" w:type="dxa"/>
+              <w:bottom w:w="80" w:type="dxa"/>
+              <w:end w:w="120" w:type="dxa"/>
+            </w:tcMar>
+          </w:tcPr>
+          <w:p>
+            <w:pPr>
+              <w:spacing w:after="0" w:line="264" w:lineRule="auto"/>
+            </w:pPr>
+            <w:r>
+              <w:rPr>
+                <w:rFonts w:ascii="Calibri" w:hAnsi="Calibri" w:eastAsia="Microsoft YaHei"/>
+                <w:b w:val="0"/>
+                <w:color w:val="000000"/>
+                <w:sz w:val="19"/>
+              </w:rPr>
+              <w:t>品种匹配</w:t>
+            </w:r>
+          </w:p>
+        </w:tc>
+        <w:tc>
+          <w:tcPr>
+            <w:tcW w:type="dxa" w:w="7060"/>
+            <w:vAlign w:val="center"/>
+            <w:tcMar>
+              <w:top w:w="80" w:type="dxa"/>
+              <w:start w:w="120" w:type="dxa"/>
+              <w:bottom w:w="80" w:type="dxa"/>
+              <w:end w:w="120" w:type="dxa"/>
+            </w:tcMar>
+          </w:tcPr>
+          <w:p>
+            <w:pPr>
+              <w:spacing w:after="0" w:line="264" w:lineRule="auto"/>
+            </w:pPr>
+            <w:r>
+              <w:rPr>
+                <w:rFonts w:ascii="Calibri" w:hAnsi="Calibri" w:eastAsia="Microsoft YaHei"/>
+                <w:b w:val="0"/>
+                <w:color w:val="000000"/>
+                <w:sz w:val="19"/>
+              </w:rPr>
+              <w:t>模板合约类型必须与开户品种映射值相同</w:t>
+            </w:r>
+          </w:p>
+        </w:tc>
+      </w:tr>
+      <w:tr>
+        <w:tc>
+          <w:tcPr>
+            <w:tcW w:type="dxa" w:w="2300"/>
+            <w:vAlign w:val="center"/>
+            <w:tcMar>
+              <w:top w:w="80" w:type="dxa"/>
+              <w:start w:w="120" w:type="dxa"/>
+              <w:bottom w:w="80" w:type="dxa"/>
+              <w:end w:w="120" w:type="dxa"/>
+            </w:tcMar>
+          </w:tcPr>
+          <w:p>
+            <w:pPr>
+              <w:spacing w:after="0" w:line="264" w:lineRule="auto"/>
+            </w:pPr>
+            <w:r>
+              <w:rPr>
+                <w:rFonts w:ascii="Calibri" w:hAnsi="Calibri" w:eastAsia="Microsoft YaHei"/>
+                <w:b w:val="0"/>
+                <w:color w:val="000000"/>
+                <w:sz w:val="19"/>
+              </w:rPr>
+              <w:t>重复命中</w:t>
+            </w:r>
+          </w:p>
+        </w:tc>
+        <w:tc>
+          <w:tcPr>
+            <w:tcW w:type="dxa" w:w="7060"/>
+            <w:vAlign w:val="center"/>
+            <w:tcMar>
+              <w:top w:w="80" w:type="dxa"/>
+              <w:start w:w="120" w:type="dxa"/>
+              <w:bottom w:w="80" w:type="dxa"/>
+              <w:end w:w="120" w:type="dxa"/>
+            </w:tcMar>
+          </w:tcPr>
+          <w:p>
+            <w:pPr>
+              <w:spacing w:after="0" w:line="264" w:lineRule="auto"/>
+            </w:pPr>
+            <w:r>
+              <w:rPr>
+                <w:rFonts w:ascii="Calibri" w:hAnsi="Calibri" w:eastAsia="Microsoft YaHei"/>
+                <w:b w:val="0"/>
+                <w:color w:val="000000"/>
+                <w:sz w:val="19"/>
+              </w:rPr>
+              <w:t>同一市场×品种存在多条有效模板行时，按模板既有顺序取首条</w:t>
+            </w:r>
+          </w:p>
+        </w:tc>
+      </w:tr>
+      <w:tr>
+        <w:tc>
+          <w:tcPr>
+            <w:tcW w:type="dxa" w:w="2300"/>
+            <w:vAlign w:val="center"/>
+            <w:tcMar>
+              <w:top w:w="80" w:type="dxa"/>
+              <w:start w:w="120" w:type="dxa"/>
+              <w:bottom w:w="80" w:type="dxa"/>
+              <w:end w:w="120" w:type="dxa"/>
+            </w:tcMar>
+          </w:tcPr>
+          <w:p>
+            <w:pPr>
+              <w:spacing w:after="0" w:line="264" w:lineRule="auto"/>
+            </w:pPr>
+            <w:r>
+              <w:rPr>
+                <w:rFonts w:ascii="Calibri" w:hAnsi="Calibri" w:eastAsia="Microsoft YaHei"/>
+                <w:b w:val="0"/>
+                <w:color w:val="000000"/>
+                <w:sz w:val="19"/>
+              </w:rPr>
+              <w:t>范围外数据</w:t>
+            </w:r>
+          </w:p>
+        </w:tc>
+        <w:tc>
+          <w:tcPr>
+            <w:tcW w:type="dxa" w:w="7060"/>
+            <w:vAlign w:val="center"/>
+            <w:tcMar>
+              <w:top w:w="80" w:type="dxa"/>
+              <w:start w:w="120" w:type="dxa"/>
+              <w:bottom w:w="80" w:type="dxa"/>
+              <w:end w:w="120" w:type="dxa"/>
+            </w:tcMar>
+          </w:tcPr>
+          <w:p>
+            <w:pPr>
+              <w:spacing w:after="0" w:line="264" w:lineRule="auto"/>
+            </w:pPr>
+            <w:r>
+              <w:rPr>
+                <w:rFonts w:ascii="Calibri" w:hAnsi="Calibri" w:eastAsia="Microsoft YaHei"/>
+                <w:b w:val="0"/>
+                <w:color w:val="000000"/>
+                <w:sz w:val="19"/>
+              </w:rPr>
+              <w:t>期货、指数期货、融券交易及未开通市场品种不生成开户明细</w:t>
+            </w:r>
+          </w:p>
+        </w:tc>
+      </w:tr>
+    </w:tbl>
+    <w:p>
+      <w:pPr>
+        <w:spacing w:after="40"/>
+      </w:pPr>
+    </w:p>
+    <w:p>
+      <w:pPr>
+        <w:pStyle w:val="Heading1"/>
+      </w:pPr>
+      <w:r>
+        <w:t>5. 缺项与保存</w:t>
+      </w:r>
+    </w:p>
+    <w:tbl>
+      <w:tblPr>
+        <w:tblStyle w:val="TableGrid"/>
+        <w:tblW w:type="dxa" w:w="9360"/>
+        <w:tblLayout w:type="fixed"/>
+        <w:tblLook w:firstColumn="1" w:firstRow="1" w:lastColumn="0" w:lastRow="0" w:noHBand="0" w:noVBand="1" w:val="04A0"/>
+        <w:tblInd w:w="120" w:type="dxa"/>
+      </w:tblPr>
+      <w:tblGrid>
+        <w:gridCol w:w="2200"/>
+        <w:gridCol w:w="3600"/>
+        <w:gridCol w:w="3560"/>
+      </w:tblGrid>
+      <w:tr>
+        <w:trPr>
+          <w:tblHeader w:val="true"/>
+        </w:trPr>
+        <w:tc>
+          <w:tcPr>
+            <w:tcW w:type="dxa" w:w="2200"/>
             <w:shd w:fill="E8EEF5"/>
             <w:vAlign w:val="center"/>
             <w:tcMar>
@@ -929,205 +1338,13 @@
                 <w:color w:val="1F4D78"/>
                 <w:sz w:val="19"/>
               </w:rPr>
-              <w:t>说明</w:t>
-            </w:r>
-          </w:p>
-        </w:tc>
-      </w:tr>
-      <w:tr>
-        <w:tc>
-          <w:tcPr>
-            <w:tcW w:type="dxa" w:w="1850"/>
-            <w:vAlign w:val="center"/>
-            <w:tcMar>
-              <w:top w:w="80" w:type="dxa"/>
-              <w:start w:w="120" w:type="dxa"/>
-              <w:bottom w:w="80" w:type="dxa"/>
-              <w:end w:w="120" w:type="dxa"/>
-            </w:tcMar>
-          </w:tcPr>
-          <w:p>
-            <w:pPr>
-              <w:spacing w:after="0" w:line="264" w:lineRule="auto"/>
-            </w:pPr>
-            <w:r>
-              <w:rPr>
-                <w:rFonts w:ascii="Calibri" w:hAnsi="Calibri" w:eastAsia="Microsoft YaHei"/>
-                <w:b w:val="0"/>
-                <w:color w:val="000000"/>
-                <w:sz w:val="19"/>
-              </w:rPr>
-              <w:t>买</w:t>
+              <w:t>情况</w:t>
             </w:r>
           </w:p>
         </w:tc>
         <w:tc>
           <w:tcPr>
-            <w:tcW w:type="dxa" w:w="3550"/>
-            <w:vAlign w:val="center"/>
-            <w:tcMar>
-              <w:top w:w="80" w:type="dxa"/>
-              <w:start w:w="120" w:type="dxa"/>
-              <w:bottom w:w="80" w:type="dxa"/>
-              <w:end w:w="120" w:type="dxa"/>
-            </w:tcMar>
-          </w:tcPr>
-          <w:p>
-            <w:pPr>
-              <w:spacing w:after="0" w:line="264" w:lineRule="auto"/>
-            </w:pPr>
-            <w:r>
-              <w:rPr>
-                <w:rFonts w:ascii="Calibri" w:hAnsi="Calibri" w:eastAsia="Microsoft YaHei"/>
-                <w:b w:val="0"/>
-                <w:color w:val="000000"/>
-                <w:sz w:val="19"/>
-              </w:rPr>
-              <w:t>买入、买开</w:t>
-            </w:r>
-          </w:p>
-        </w:tc>
-        <w:tc>
-          <w:tcPr>
-            <w:tcW w:type="dxa" w:w="3960"/>
-            <w:vAlign w:val="center"/>
-            <w:tcMar>
-              <w:top w:w="80" w:type="dxa"/>
-              <w:start w:w="120" w:type="dxa"/>
-              <w:bottom w:w="80" w:type="dxa"/>
-              <w:end w:w="120" w:type="dxa"/>
-            </w:tcMar>
-          </w:tcPr>
-          <w:p>
-            <w:pPr>
-              <w:spacing w:after="0" w:line="264" w:lineRule="auto"/>
-            </w:pPr>
-            <w:r>
-              <w:rPr>
-                <w:rFonts w:ascii="Calibri" w:hAnsi="Calibri" w:eastAsia="Microsoft YaHei"/>
-                <w:b w:val="0"/>
-                <w:color w:val="000000"/>
-                <w:sz w:val="19"/>
-              </w:rPr>
-              <w:t>业务及品种校验通过后统一转换为买</w:t>
-            </w:r>
-          </w:p>
-        </w:tc>
-      </w:tr>
-      <w:tr>
-        <w:tc>
-          <w:tcPr>
-            <w:tcW w:type="dxa" w:w="1850"/>
-            <w:vAlign w:val="center"/>
-            <w:tcMar>
-              <w:top w:w="80" w:type="dxa"/>
-              <w:start w:w="120" w:type="dxa"/>
-              <w:bottom w:w="80" w:type="dxa"/>
-              <w:end w:w="120" w:type="dxa"/>
-            </w:tcMar>
-          </w:tcPr>
-          <w:p>
-            <w:pPr>
-              <w:spacing w:after="0" w:line="264" w:lineRule="auto"/>
-            </w:pPr>
-            <w:r>
-              <w:rPr>
-                <w:rFonts w:ascii="Calibri" w:hAnsi="Calibri" w:eastAsia="Microsoft YaHei"/>
-                <w:b w:val="0"/>
-                <w:color w:val="000000"/>
-                <w:sz w:val="19"/>
-              </w:rPr>
-              <w:t>卖</w:t>
-            </w:r>
-          </w:p>
-        </w:tc>
-        <w:tc>
-          <w:tcPr>
-            <w:tcW w:type="dxa" w:w="3550"/>
-            <w:vAlign w:val="center"/>
-            <w:tcMar>
-              <w:top w:w="80" w:type="dxa"/>
-              <w:start w:w="120" w:type="dxa"/>
-              <w:bottom w:w="80" w:type="dxa"/>
-              <w:end w:w="120" w:type="dxa"/>
-            </w:tcMar>
-          </w:tcPr>
-          <w:p>
-            <w:pPr>
-              <w:spacing w:after="0" w:line="264" w:lineRule="auto"/>
-            </w:pPr>
-            <w:r>
-              <w:rPr>
-                <w:rFonts w:ascii="Calibri" w:hAnsi="Calibri" w:eastAsia="Microsoft YaHei"/>
-                <w:b w:val="0"/>
-                <w:color w:val="000000"/>
-                <w:sz w:val="19"/>
-              </w:rPr>
-              <w:t>卖出、卖平</w:t>
-            </w:r>
-          </w:p>
-        </w:tc>
-        <w:tc>
-          <w:tcPr>
-            <w:tcW w:type="dxa" w:w="3960"/>
-            <w:vAlign w:val="center"/>
-            <w:tcMar>
-              <w:top w:w="80" w:type="dxa"/>
-              <w:start w:w="120" w:type="dxa"/>
-              <w:bottom w:w="80" w:type="dxa"/>
-              <w:end w:w="120" w:type="dxa"/>
-            </w:tcMar>
-          </w:tcPr>
-          <w:p>
-            <w:pPr>
-              <w:spacing w:after="0" w:line="264" w:lineRule="auto"/>
-            </w:pPr>
-            <w:r>
-              <w:rPr>
-                <w:rFonts w:ascii="Calibri" w:hAnsi="Calibri" w:eastAsia="Microsoft YaHei"/>
-                <w:b w:val="0"/>
-                <w:color w:val="000000"/>
-                <w:sz w:val="19"/>
-              </w:rPr>
-              <w:t>业务及品种校验通过后统一转换为卖</w:t>
-            </w:r>
-          </w:p>
-        </w:tc>
-      </w:tr>
-    </w:tbl>
-    <w:p>
-      <w:pPr>
-        <w:spacing w:after="40"/>
-      </w:pPr>
-    </w:p>
-    <w:p>
-      <w:pPr>
-        <w:pStyle w:val="Heading1"/>
-      </w:pPr>
-      <w:r>
-        <w:t>5. 跳过与报错规则</w:t>
-      </w:r>
-    </w:p>
-    <w:tbl>
-      <w:tblPr>
-        <w:tblStyle w:val="TableGrid"/>
-        <w:tblW w:type="dxa" w:w="9360"/>
-        <w:tblLayout w:type="fixed"/>
-        <w:tblLook w:firstColumn="1" w:firstRow="1" w:lastColumn="0" w:lastRow="0" w:noHBand="0" w:noVBand="1" w:val="04A0"/>
-        <w:tblInd w:w="120" w:type="dxa"/>
-      </w:tblPr>
-      <w:tblGrid>
-        <w:gridCol w:w="1900"/>
-        <w:gridCol w:w="4700"/>
-        <w:gridCol w:w="2760"/>
-      </w:tblGrid>
-      <w:tr>
-        <w:trPr>
-          <w:tblHeader w:val="true"/>
-        </w:trPr>
-        <w:tc>
-          <w:tcPr>
-            <w:tcW w:type="dxa" w:w="1900"/>
+            <w:tcW w:type="dxa" w:w="3600"/>
             <w:shd w:fill="E8EEF5"/>
             <w:vAlign w:val="center"/>
             <w:tcMar>
@@ -1148,13 +1365,13 @@
                 <w:color w:val="1F4D78"/>
                 <w:sz w:val="19"/>
               </w:rPr>
-              <w:t>校验项</w:t>
+              <w:t>页面表现</w:t>
             </w:r>
           </w:p>
         </w:tc>
         <w:tc>
           <w:tcPr>
-            <w:tcW w:type="dxa" w:w="4700"/>
+            <w:tcW w:type="dxa" w:w="3560"/>
             <w:shd w:fill="E8EEF5"/>
             <w:vAlign w:val="center"/>
             <w:tcMar>
@@ -1175,34 +1392,7 @@
                 <w:color w:val="1F4D78"/>
                 <w:sz w:val="19"/>
               </w:rPr>
-              <w:t>不符合时的处理</w:t>
-            </w:r>
-          </w:p>
-        </w:tc>
-        <w:tc>
-          <w:tcPr>
-            <w:tcW w:type="dxa" w:w="2760"/>
-            <w:shd w:fill="E8EEF5"/>
-            <w:vAlign w:val="center"/>
-            <w:tcMar>
-              <w:top w:w="80" w:type="dxa"/>
-              <w:start w:w="120" w:type="dxa"/>
-              <w:bottom w:w="80" w:type="dxa"/>
-              <w:end w:w="120" w:type="dxa"/>
-            </w:tcMar>
-          </w:tcPr>
-          <w:p>
-            <w:pPr>
-              <w:spacing w:after="0" w:line="240" w:lineRule="auto"/>
-            </w:pPr>
-            <w:r>
-              <w:rPr>
-                <w:rFonts w:ascii="Calibri" w:hAnsi="Calibri" w:eastAsia="Microsoft YaHei"/>
-                <w:b/>
-                <w:color w:val="1F4D78"/>
-                <w:sz w:val="19"/>
-              </w:rPr>
-              <w:t>页面提示</w:t>
+              <w:t>保存规则</w:t>
             </w:r>
           </w:p>
         </w:tc>
@@ -1210,520 +1400,7 @@
       <w:tr>
         <w:tc>
           <w:tcPr>
-            <w:tcW w:type="dxa" w:w="1900"/>
-            <w:vAlign w:val="center"/>
-            <w:tcMar>
-              <w:top w:w="80" w:type="dxa"/>
-              <w:start w:w="120" w:type="dxa"/>
-              <w:bottom w:w="80" w:type="dxa"/>
-              <w:end w:w="120" w:type="dxa"/>
-            </w:tcMar>
-          </w:tcPr>
-          <w:p>
-            <w:pPr>
-              <w:spacing w:after="0" w:line="264" w:lineRule="auto"/>
-            </w:pPr>
-            <w:r>
-              <w:rPr>
-                <w:rFonts w:ascii="Calibri" w:hAnsi="Calibri" w:eastAsia="Microsoft YaHei"/>
-                <w:b w:val="0"/>
-                <w:color w:val="000000"/>
-                <w:sz w:val="19"/>
-              </w:rPr>
-              <w:t>业务类型</w:t>
-            </w:r>
-          </w:p>
-        </w:tc>
-        <w:tc>
-          <w:tcPr>
-            <w:tcW w:type="dxa" w:w="4700"/>
-            <w:vAlign w:val="center"/>
-            <w:tcMar>
-              <w:top w:w="80" w:type="dxa"/>
-              <w:start w:w="120" w:type="dxa"/>
-              <w:bottom w:w="80" w:type="dxa"/>
-              <w:end w:w="120" w:type="dxa"/>
-            </w:tcMar>
-          </w:tcPr>
-          <w:p>
-            <w:pPr>
-              <w:spacing w:after="0" w:line="264" w:lineRule="auto"/>
-            </w:pPr>
-            <w:r>
-              <w:rPr>
-                <w:rFonts w:ascii="Calibri" w:hAnsi="Calibri" w:eastAsia="Microsoft YaHei"/>
-                <w:b w:val="0"/>
-                <w:color w:val="000000"/>
-                <w:sz w:val="19"/>
-              </w:rPr>
-              <w:t>非普通交易的模板行跳过</w:t>
-            </w:r>
-          </w:p>
-        </w:tc>
-        <w:tc>
-          <w:tcPr>
-            <w:tcW w:type="dxa" w:w="2760"/>
-            <w:vAlign w:val="center"/>
-            <w:tcMar>
-              <w:top w:w="80" w:type="dxa"/>
-              <w:start w:w="120" w:type="dxa"/>
-              <w:bottom w:w="80" w:type="dxa"/>
-              <w:end w:w="120" w:type="dxa"/>
-            </w:tcMar>
-          </w:tcPr>
-          <w:p>
-            <w:pPr>
-              <w:spacing w:after="0" w:line="264" w:lineRule="auto"/>
-            </w:pPr>
-            <w:r>
-              <w:rPr>
-                <w:rFonts w:ascii="Calibri" w:hAnsi="Calibri" w:eastAsia="Microsoft YaHei"/>
-                <w:b w:val="0"/>
-                <w:color w:val="000000"/>
-                <w:sz w:val="19"/>
-              </w:rPr>
-              <w:t>业务不支持</w:t>
-            </w:r>
-          </w:p>
-        </w:tc>
-      </w:tr>
-      <w:tr>
-        <w:tc>
-          <w:tcPr>
-            <w:tcW w:type="dxa" w:w="1900"/>
-            <w:vAlign w:val="center"/>
-            <w:tcMar>
-              <w:top w:w="80" w:type="dxa"/>
-              <w:start w:w="120" w:type="dxa"/>
-              <w:bottom w:w="80" w:type="dxa"/>
-              <w:end w:w="120" w:type="dxa"/>
-            </w:tcMar>
-          </w:tcPr>
-          <w:p>
-            <w:pPr>
-              <w:spacing w:after="0" w:line="264" w:lineRule="auto"/>
-            </w:pPr>
-            <w:r>
-              <w:rPr>
-                <w:rFonts w:ascii="Calibri" w:hAnsi="Calibri" w:eastAsia="Microsoft YaHei"/>
-                <w:b w:val="0"/>
-                <w:color w:val="000000"/>
-                <w:sz w:val="19"/>
-              </w:rPr>
-              <w:t>合约类型</w:t>
-            </w:r>
-          </w:p>
-        </w:tc>
-        <w:tc>
-          <w:tcPr>
-            <w:tcW w:type="dxa" w:w="4700"/>
-            <w:vAlign w:val="center"/>
-            <w:tcMar>
-              <w:top w:w="80" w:type="dxa"/>
-              <w:start w:w="120" w:type="dxa"/>
-              <w:bottom w:w="80" w:type="dxa"/>
-              <w:end w:w="120" w:type="dxa"/>
-            </w:tcMar>
-          </w:tcPr>
-          <w:p>
-            <w:pPr>
-              <w:spacing w:after="0" w:line="264" w:lineRule="auto"/>
-            </w:pPr>
-            <w:r>
-              <w:rPr>
-                <w:rFonts w:ascii="Calibri" w:hAnsi="Calibri" w:eastAsia="Microsoft YaHei"/>
-                <w:b w:val="0"/>
-                <w:color w:val="000000"/>
-                <w:sz w:val="19"/>
-              </w:rPr>
-              <w:t>期货、指数期货及未建立映射的类型跳过</w:t>
-            </w:r>
-          </w:p>
-        </w:tc>
-        <w:tc>
-          <w:tcPr>
-            <w:tcW w:type="dxa" w:w="2760"/>
-            <w:vAlign w:val="center"/>
-            <w:tcMar>
-              <w:top w:w="80" w:type="dxa"/>
-              <w:start w:w="120" w:type="dxa"/>
-              <w:bottom w:w="80" w:type="dxa"/>
-              <w:end w:w="120" w:type="dxa"/>
-            </w:tcMar>
-          </w:tcPr>
-          <w:p>
-            <w:pPr>
-              <w:spacing w:after="0" w:line="264" w:lineRule="auto"/>
-            </w:pPr>
-            <w:r>
-              <w:rPr>
-                <w:rFonts w:ascii="Calibri" w:hAnsi="Calibri" w:eastAsia="Microsoft YaHei"/>
-                <w:b w:val="0"/>
-                <w:color w:val="000000"/>
-                <w:sz w:val="19"/>
-              </w:rPr>
-              <w:t>品种不支持或无映射</w:t>
-            </w:r>
-          </w:p>
-        </w:tc>
-      </w:tr>
-      <w:tr>
-        <w:tc>
-          <w:tcPr>
-            <w:tcW w:type="dxa" w:w="1900"/>
-            <w:vAlign w:val="center"/>
-            <w:tcMar>
-              <w:top w:w="80" w:type="dxa"/>
-              <w:start w:w="120" w:type="dxa"/>
-              <w:bottom w:w="80" w:type="dxa"/>
-              <w:end w:w="120" w:type="dxa"/>
-            </w:tcMar>
-          </w:tcPr>
-          <w:p>
-            <w:pPr>
-              <w:spacing w:after="0" w:line="264" w:lineRule="auto"/>
-            </w:pPr>
-            <w:r>
-              <w:rPr>
-                <w:rFonts w:ascii="Calibri" w:hAnsi="Calibri" w:eastAsia="Microsoft YaHei"/>
-                <w:b w:val="0"/>
-                <w:color w:val="000000"/>
-                <w:sz w:val="19"/>
-              </w:rPr>
-              <w:t>交易所</w:t>
-            </w:r>
-          </w:p>
-        </w:tc>
-        <w:tc>
-          <w:tcPr>
-            <w:tcW w:type="dxa" w:w="4700"/>
-            <w:vAlign w:val="center"/>
-            <w:tcMar>
-              <w:top w:w="80" w:type="dxa"/>
-              <w:start w:w="120" w:type="dxa"/>
-              <w:bottom w:w="80" w:type="dxa"/>
-              <w:end w:w="120" w:type="dxa"/>
-            </w:tcMar>
-          </w:tcPr>
-          <w:p>
-            <w:pPr>
-              <w:spacing w:after="0" w:line="264" w:lineRule="auto"/>
-            </w:pPr>
-            <w:r>
-              <w:rPr>
-                <w:rFonts w:ascii="Calibri" w:hAnsi="Calibri" w:eastAsia="Microsoft YaHei"/>
-                <w:b w:val="0"/>
-                <w:color w:val="000000"/>
-                <w:sz w:val="19"/>
-              </w:rPr>
-              <w:t>交易所无法映射到开户股票市场时跳过</w:t>
-            </w:r>
-          </w:p>
-        </w:tc>
-        <w:tc>
-          <w:tcPr>
-            <w:tcW w:type="dxa" w:w="2760"/>
-            <w:vAlign w:val="center"/>
-            <w:tcMar>
-              <w:top w:w="80" w:type="dxa"/>
-              <w:start w:w="120" w:type="dxa"/>
-              <w:bottom w:w="80" w:type="dxa"/>
-              <w:end w:w="120" w:type="dxa"/>
-            </w:tcMar>
-          </w:tcPr>
-          <w:p>
-            <w:pPr>
-              <w:spacing w:after="0" w:line="264" w:lineRule="auto"/>
-            </w:pPr>
-            <w:r>
-              <w:rPr>
-                <w:rFonts w:ascii="Calibri" w:hAnsi="Calibri" w:eastAsia="Microsoft YaHei"/>
-                <w:b w:val="0"/>
-                <w:color w:val="000000"/>
-                <w:sz w:val="19"/>
-              </w:rPr>
-              <w:t>交易所无对应市场</w:t>
-            </w:r>
-          </w:p>
-        </w:tc>
-      </w:tr>
-      <w:tr>
-        <w:tc>
-          <w:tcPr>
-            <w:tcW w:type="dxa" w:w="1900"/>
-            <w:vAlign w:val="center"/>
-            <w:tcMar>
-              <w:top w:w="80" w:type="dxa"/>
-              <w:start w:w="120" w:type="dxa"/>
-              <w:bottom w:w="80" w:type="dxa"/>
-              <w:end w:w="120" w:type="dxa"/>
-            </w:tcMar>
-          </w:tcPr>
-          <w:p>
-            <w:pPr>
-              <w:spacing w:after="0" w:line="264" w:lineRule="auto"/>
-            </w:pPr>
-            <w:r>
-              <w:rPr>
-                <w:rFonts w:ascii="Calibri" w:hAnsi="Calibri" w:eastAsia="Microsoft YaHei"/>
-                <w:b w:val="0"/>
-                <w:color w:val="000000"/>
-                <w:sz w:val="19"/>
-              </w:rPr>
-              <w:t>市场权限</w:t>
-            </w:r>
-          </w:p>
-        </w:tc>
-        <w:tc>
-          <w:tcPr>
-            <w:tcW w:type="dxa" w:w="4700"/>
-            <w:vAlign w:val="center"/>
-            <w:tcMar>
-              <w:top w:w="80" w:type="dxa"/>
-              <w:start w:w="120" w:type="dxa"/>
-              <w:bottom w:w="80" w:type="dxa"/>
-              <w:end w:w="120" w:type="dxa"/>
-            </w:tcMar>
-          </w:tcPr>
-          <w:p>
-            <w:pPr>
-              <w:spacing w:after="0" w:line="264" w:lineRule="auto"/>
-            </w:pPr>
-            <w:r>
-              <w:rPr>
-                <w:rFonts w:ascii="Calibri" w:hAnsi="Calibri" w:eastAsia="Microsoft YaHei"/>
-                <w:b w:val="0"/>
-                <w:color w:val="000000"/>
-                <w:sz w:val="19"/>
-              </w:rPr>
-              <w:t>账户未开通对应股票市场时跳过</w:t>
-            </w:r>
-          </w:p>
-        </w:tc>
-        <w:tc>
-          <w:tcPr>
-            <w:tcW w:type="dxa" w:w="2760"/>
-            <w:vAlign w:val="center"/>
-            <w:tcMar>
-              <w:top w:w="80" w:type="dxa"/>
-              <w:start w:w="120" w:type="dxa"/>
-              <w:bottom w:w="80" w:type="dxa"/>
-              <w:end w:w="120" w:type="dxa"/>
-            </w:tcMar>
-          </w:tcPr>
-          <w:p>
-            <w:pPr>
-              <w:spacing w:after="0" w:line="264" w:lineRule="auto"/>
-            </w:pPr>
-            <w:r>
-              <w:rPr>
-                <w:rFonts w:ascii="Calibri" w:hAnsi="Calibri" w:eastAsia="Microsoft YaHei"/>
-                <w:b w:val="0"/>
-                <w:color w:val="000000"/>
-                <w:sz w:val="19"/>
-              </w:rPr>
-              <w:t>账户未开通市场权限</w:t>
-            </w:r>
-          </w:p>
-        </w:tc>
-      </w:tr>
-      <w:tr>
-        <w:tc>
-          <w:tcPr>
-            <w:tcW w:type="dxa" w:w="1900"/>
-            <w:vAlign w:val="center"/>
-            <w:tcMar>
-              <w:top w:w="80" w:type="dxa"/>
-              <w:start w:w="120" w:type="dxa"/>
-              <w:bottom w:w="80" w:type="dxa"/>
-              <w:end w:w="120" w:type="dxa"/>
-            </w:tcMar>
-          </w:tcPr>
-          <w:p>
-            <w:pPr>
-              <w:spacing w:after="0" w:line="264" w:lineRule="auto"/>
-            </w:pPr>
-            <w:r>
-              <w:rPr>
-                <w:rFonts w:ascii="Calibri" w:hAnsi="Calibri" w:eastAsia="Microsoft YaHei"/>
-                <w:b w:val="0"/>
-                <w:color w:val="000000"/>
-                <w:sz w:val="19"/>
-              </w:rPr>
-              <w:t>品种权限</w:t>
-            </w:r>
-          </w:p>
-        </w:tc>
-        <w:tc>
-          <w:tcPr>
-            <w:tcW w:type="dxa" w:w="4700"/>
-            <w:vAlign w:val="center"/>
-            <w:tcMar>
-              <w:top w:w="80" w:type="dxa"/>
-              <w:start w:w="120" w:type="dxa"/>
-              <w:bottom w:w="80" w:type="dxa"/>
-              <w:end w:w="120" w:type="dxa"/>
-            </w:tcMar>
-          </w:tcPr>
-          <w:p>
-            <w:pPr>
-              <w:spacing w:after="0" w:line="264" w:lineRule="auto"/>
-            </w:pPr>
-            <w:r>
-              <w:rPr>
-                <w:rFonts w:ascii="Calibri" w:hAnsi="Calibri" w:eastAsia="Microsoft YaHei"/>
-                <w:b w:val="0"/>
-                <w:color w:val="000000"/>
-                <w:sz w:val="19"/>
-              </w:rPr>
-              <w:t>账户在该市场未开通对应品种时跳过</w:t>
-            </w:r>
-          </w:p>
-        </w:tc>
-        <w:tc>
-          <w:tcPr>
-            <w:tcW w:type="dxa" w:w="2760"/>
-            <w:vAlign w:val="center"/>
-            <w:tcMar>
-              <w:top w:w="80" w:type="dxa"/>
-              <w:start w:w="120" w:type="dxa"/>
-              <w:bottom w:w="80" w:type="dxa"/>
-              <w:end w:w="120" w:type="dxa"/>
-            </w:tcMar>
-          </w:tcPr>
-          <w:p>
-            <w:pPr>
-              <w:spacing w:after="0" w:line="264" w:lineRule="auto"/>
-            </w:pPr>
-            <w:r>
-              <w:rPr>
-                <w:rFonts w:ascii="Calibri" w:hAnsi="Calibri" w:eastAsia="Microsoft YaHei"/>
-                <w:b w:val="0"/>
-                <w:color w:val="000000"/>
-                <w:sz w:val="19"/>
-              </w:rPr>
-              <w:t>市场未开通该品种</w:t>
-            </w:r>
-          </w:p>
-        </w:tc>
-      </w:tr>
-    </w:tbl>
-    <w:p>
-      <w:pPr>
-        <w:spacing w:after="40"/>
-      </w:pPr>
-    </w:p>
-    <w:p>
-      <w:pPr>
-        <w:pStyle w:val="Heading1"/>
-      </w:pPr>
-      <w:r>
-        <w:t>6. 导入结果判定</w:t>
-      </w:r>
-    </w:p>
-    <w:tbl>
-      <w:tblPr>
-        <w:tblStyle w:val="TableGrid"/>
-        <w:tblW w:type="dxa" w:w="9360"/>
-        <w:tblLayout w:type="fixed"/>
-        <w:tblLook w:firstColumn="1" w:firstRow="1" w:lastColumn="0" w:lastRow="0" w:noHBand="0" w:noVBand="1" w:val="04A0"/>
-        <w:tblInd w:w="120" w:type="dxa"/>
-      </w:tblPr>
-      <w:tblGrid>
-        <w:gridCol w:w="1850"/>
-        <w:gridCol w:w="4300"/>
-        <w:gridCol w:w="3210"/>
-      </w:tblGrid>
-      <w:tr>
-        <w:trPr>
-          <w:tblHeader w:val="true"/>
-        </w:trPr>
-        <w:tc>
-          <w:tcPr>
-            <w:tcW w:type="dxa" w:w="1850"/>
-            <w:shd w:fill="E8EEF5"/>
-            <w:vAlign w:val="center"/>
-            <w:tcMar>
-              <w:top w:w="80" w:type="dxa"/>
-              <w:start w:w="120" w:type="dxa"/>
-              <w:bottom w:w="80" w:type="dxa"/>
-              <w:end w:w="120" w:type="dxa"/>
-            </w:tcMar>
-          </w:tcPr>
-          <w:p>
-            <w:pPr>
-              <w:spacing w:after="0" w:line="240" w:lineRule="auto"/>
-            </w:pPr>
-            <w:r>
-              <w:rPr>
-                <w:rFonts w:ascii="Calibri" w:hAnsi="Calibri" w:eastAsia="Microsoft YaHei"/>
-                <w:b/>
-                <w:color w:val="1F4D78"/>
-                <w:sz w:val="19"/>
-              </w:rPr>
-              <w:t>状态</w:t>
-            </w:r>
-          </w:p>
-        </w:tc>
-        <w:tc>
-          <w:tcPr>
-            <w:tcW w:type="dxa" w:w="4300"/>
-            <w:shd w:fill="E8EEF5"/>
-            <w:vAlign w:val="center"/>
-            <w:tcMar>
-              <w:top w:w="80" w:type="dxa"/>
-              <w:start w:w="120" w:type="dxa"/>
-              <w:bottom w:w="80" w:type="dxa"/>
-              <w:end w:w="120" w:type="dxa"/>
-            </w:tcMar>
-          </w:tcPr>
-          <w:p>
-            <w:pPr>
-              <w:spacing w:after="0" w:line="240" w:lineRule="auto"/>
-            </w:pPr>
-            <w:r>
-              <w:rPr>
-                <w:rFonts w:ascii="Calibri" w:hAnsi="Calibri" w:eastAsia="Microsoft YaHei"/>
-                <w:b/>
-                <w:color w:val="1F4D78"/>
-                <w:sz w:val="19"/>
-              </w:rPr>
-              <w:t>判定条件</w:t>
-            </w:r>
-          </w:p>
-        </w:tc>
-        <w:tc>
-          <w:tcPr>
-            <w:tcW w:type="dxa" w:w="3210"/>
-            <w:shd w:fill="E8EEF5"/>
-            <w:vAlign w:val="center"/>
-            <w:tcMar>
-              <w:top w:w="80" w:type="dxa"/>
-              <w:start w:w="120" w:type="dxa"/>
-              <w:bottom w:w="80" w:type="dxa"/>
-              <w:end w:w="120" w:type="dxa"/>
-            </w:tcMar>
-          </w:tcPr>
-          <w:p>
-            <w:pPr>
-              <w:spacing w:after="0" w:line="240" w:lineRule="auto"/>
-            </w:pPr>
-            <w:r>
-              <w:rPr>
-                <w:rFonts w:ascii="Calibri" w:hAnsi="Calibri" w:eastAsia="Microsoft YaHei"/>
-                <w:b/>
-                <w:color w:val="1F4D78"/>
-                <w:sz w:val="19"/>
-              </w:rPr>
-              <w:t>可执行操作</w:t>
-            </w:r>
-          </w:p>
-        </w:tc>
-      </w:tr>
-      <w:tr>
-        <w:tc>
-          <w:tcPr>
-            <w:tcW w:type="dxa" w:w="1850"/>
+            <w:tcW w:type="dxa" w:w="2200"/>
             <w:vAlign w:val="center"/>
             <w:tcMar>
               <w:top w:w="80" w:type="dxa"/>
@@ -1749,7 +1426,7 @@
         </w:tc>
         <w:tc>
           <w:tcPr>
-            <w:tcW w:type="dxa" w:w="4300"/>
+            <w:tcW w:type="dxa" w:w="3600"/>
             <w:vAlign w:val="center"/>
             <w:tcMar>
               <w:top w:w="80" w:type="dxa"/>
@@ -1769,13 +1446,13 @@
                 <w:color w:val="000000"/>
                 <w:sz w:val="19"/>
               </w:rPr>
-              <w:t>所有模板配置均可生成开户规则</w:t>
+              <w:t>每行自动填入模板与方向</w:t>
             </w:r>
           </w:p>
         </w:tc>
         <w:tc>
           <w:tcPr>
-            <w:tcW w:type="dxa" w:w="3210"/>
+            <w:tcW w:type="dxa" w:w="3560"/>
             <w:vAlign w:val="center"/>
             <w:tcMar>
               <w:top w:w="80" w:type="dxa"/>
@@ -1795,7 +1472,7 @@
                 <w:color w:val="000000"/>
                 <w:sz w:val="19"/>
               </w:rPr>
-              <w:t>确认导入全部规则</w:t>
+              <w:t>校验通过后可保存</w:t>
             </w:r>
           </w:p>
         </w:tc>
@@ -1803,7 +1480,7 @@
       <w:tr>
         <w:tc>
           <w:tcPr>
-            <w:tcW w:type="dxa" w:w="1850"/>
+            <w:tcW w:type="dxa" w:w="2200"/>
             <w:vAlign w:val="center"/>
             <w:tcMar>
               <w:top w:w="80" w:type="dxa"/>
@@ -1823,13 +1500,13 @@
                 <w:color w:val="000000"/>
                 <w:sz w:val="19"/>
               </w:rPr>
-              <w:t>部分匹配</w:t>
+              <w:t>模板缺少部分品种</w:t>
             </w:r>
           </w:p>
         </w:tc>
         <w:tc>
           <w:tcPr>
-            <w:tcW w:type="dxa" w:w="4300"/>
+            <w:tcW w:type="dxa" w:w="3600"/>
             <w:vAlign w:val="center"/>
             <w:tcMar>
               <w:top w:w="80" w:type="dxa"/>
@@ -1849,13 +1526,13 @@
                 <w:color w:val="000000"/>
                 <w:sz w:val="19"/>
               </w:rPr>
-              <w:t>至少 1 条可导入，同时存在跳过项</w:t>
+              <w:t>对应行两个可编辑字段为空</w:t>
             </w:r>
           </w:p>
         </w:tc>
         <w:tc>
           <w:tcPr>
-            <w:tcW w:type="dxa" w:w="3210"/>
+            <w:tcW w:type="dxa" w:w="3560"/>
             <w:vAlign w:val="center"/>
             <w:tcMar>
               <w:top w:w="80" w:type="dxa"/>
@@ -1875,7 +1552,7 @@
                 <w:color w:val="000000"/>
                 <w:sz w:val="19"/>
               </w:rPr>
-              <w:t>仅导入匹配规则</w:t>
+              <w:t>用户补全空白行后可保存</w:t>
             </w:r>
           </w:p>
         </w:tc>
@@ -1883,7 +1560,7 @@
       <w:tr>
         <w:tc>
           <w:tcPr>
-            <w:tcW w:type="dxa" w:w="1850"/>
+            <w:tcW w:type="dxa" w:w="2200"/>
             <w:vAlign w:val="center"/>
             <w:tcMar>
               <w:top w:w="80" w:type="dxa"/>
@@ -1903,13 +1580,13 @@
                 <w:color w:val="000000"/>
                 <w:sz w:val="19"/>
               </w:rPr>
-              <w:t>无法导入</w:t>
+              <w:t>存在未完成行</w:t>
             </w:r>
           </w:p>
         </w:tc>
         <w:tc>
           <w:tcPr>
-            <w:tcW w:type="dxa" w:w="4300"/>
+            <w:tcW w:type="dxa" w:w="3600"/>
             <w:vAlign w:val="center"/>
             <w:tcMar>
               <w:top w:w="80" w:type="dxa"/>
@@ -1929,13 +1606,13 @@
                 <w:color w:val="000000"/>
                 <w:sz w:val="19"/>
               </w:rPr>
-              <w:t>可导入规则数为 0</w:t>
+              <w:t>空白行突出显示</w:t>
             </w:r>
           </w:p>
         </w:tc>
         <w:tc>
           <w:tcPr>
-            <w:tcW w:type="dxa" w:w="3210"/>
+            <w:tcW w:type="dxa" w:w="3560"/>
             <w:vAlign w:val="center"/>
             <w:tcMar>
               <w:top w:w="80" w:type="dxa"/>
@@ -1955,7 +1632,87 @@
                 <w:color w:val="000000"/>
                 <w:sz w:val="19"/>
               </w:rPr>
-              <w:t>不能确认导入，原配置保持不变</w:t>
+              <w:t>阻止保存并提示未完成数量</w:t>
+            </w:r>
+          </w:p>
+        </w:tc>
+      </w:tr>
+      <w:tr>
+        <w:tc>
+          <w:tcPr>
+            <w:tcW w:type="dxa" w:w="2200"/>
+            <w:vAlign w:val="center"/>
+            <w:tcMar>
+              <w:top w:w="80" w:type="dxa"/>
+              <w:start w:w="120" w:type="dxa"/>
+              <w:bottom w:w="80" w:type="dxa"/>
+              <w:end w:w="120" w:type="dxa"/>
+            </w:tcMar>
+          </w:tcPr>
+          <w:p>
+            <w:pPr>
+              <w:spacing w:after="0" w:line="264" w:lineRule="auto"/>
+            </w:pPr>
+            <w:r>
+              <w:rPr>
+                <w:rFonts w:ascii="Calibri" w:hAnsi="Calibri" w:eastAsia="Microsoft YaHei"/>
+                <w:b w:val="0"/>
+                <w:color w:val="000000"/>
+                <w:sz w:val="19"/>
+              </w:rPr>
+              <w:t>权限发生变化</w:t>
+            </w:r>
+          </w:p>
+        </w:tc>
+        <w:tc>
+          <w:tcPr>
+            <w:tcW w:type="dxa" w:w="3600"/>
+            <w:vAlign w:val="center"/>
+            <w:tcMar>
+              <w:top w:w="80" w:type="dxa"/>
+              <w:start w:w="120" w:type="dxa"/>
+              <w:bottom w:w="80" w:type="dxa"/>
+              <w:end w:w="120" w:type="dxa"/>
+            </w:tcMar>
+          </w:tcPr>
+          <w:p>
+            <w:pPr>
+              <w:spacing w:after="0" w:line="264" w:lineRule="auto"/>
+            </w:pPr>
+            <w:r>
+              <w:rPr>
+                <w:rFonts w:ascii="Calibri" w:hAnsi="Calibri" w:eastAsia="Microsoft YaHei"/>
+                <w:b w:val="0"/>
+                <w:color w:val="000000"/>
+                <w:sz w:val="19"/>
+              </w:rPr>
+              <w:t>下方行立即随权限增删</w:t>
+            </w:r>
+          </w:p>
+        </w:tc>
+        <w:tc>
+          <w:tcPr>
+            <w:tcW w:type="dxa" w:w="3560"/>
+            <w:vAlign w:val="center"/>
+            <w:tcMar>
+              <w:top w:w="80" w:type="dxa"/>
+              <w:start w:w="120" w:type="dxa"/>
+              <w:bottom w:w="80" w:type="dxa"/>
+              <w:end w:w="120" w:type="dxa"/>
+            </w:tcMar>
+          </w:tcPr>
+          <w:p>
+            <w:pPr>
+              <w:spacing w:after="0" w:line="264" w:lineRule="auto"/>
+            </w:pPr>
+            <w:r>
+              <w:rPr>
+                <w:rFonts w:ascii="Calibri" w:hAnsi="Calibri" w:eastAsia="Microsoft YaHei"/>
+                <w:b w:val="0"/>
+                <w:color w:val="000000"/>
+                <w:sz w:val="19"/>
+              </w:rPr>
+              <w:t>后端以最新权限再次校验</w:t>
             </w:r>
           </w:p>
         </w:tc>
@@ -2008,7 +1765,7 @@
                 <w:color w:val="000000"/>
                 <w:sz w:val="20"/>
               </w:rPr>
-              <w:t>同一模板行包含多个交易所并命中多个开户市场时，系统会拆分为多条规则并分别校验权限。模板始终只读；导入只更新当前账户的报单排序编辑状态，不修改报单排序模板源数据。</w:t>
+              <w:t>页面显示的“沪深”不是直接提交值。保存时使用 tradingMarket 码表转换为“A股”；模板匹配则使用 SH、SZ、SHC、SZC 标签集合。模板仅被读取，开户操作不会修改模板配置。</w:t>
             </w:r>
           </w:p>
         </w:tc>
@@ -2018,7 +1775,7 @@
       <w:headerReference w:type="default" r:id="rId9"/>
       <w:footerReference w:type="default" r:id="rId10"/>
       <w:pgSz w:w="12240" w:h="15840"/>
-      <w:pgMar w:top="1440" w:right="1440" w:bottom="1440" w:left="1440" w:header="708" w:footer="708" w:gutter="0"/>
+      <w:pgMar w:top="1152" w:right="1080" w:bottom="1080" w:left="1080" w:header="720" w:footer="720" w:gutter="0"/>
       <w:cols w:space="720"/>
       <w:docGrid w:linePitch="360"/>
     </w:sectPr>
@@ -2040,7 +1797,7 @@
         <w:color w:val="667085"/>
         <w:sz w:val="18"/>
       </w:rPr>
-      <w:t>交易员查阅版</w:t>
+      <w:t>交易员查阅版｜版本 2.0</w:t>
     </w:r>
   </w:p>
 </w:ftr>
@@ -2051,7 +1808,6 @@
   <w:p>
     <w:pPr>
       <w:pStyle w:val="Header"/>
-      <w:jc w:val="left"/>
     </w:pPr>
     <w:r>
       <w:rPr>
@@ -2060,7 +1816,7 @@
         <w:color w:val="667085"/>
         <w:sz w:val="18"/>
       </w:rPr>
-      <w:t>OMS 开户配置｜报单排序模板导入</w:t>
+      <w:t>OMS 开户配置｜报单排序模板引用规则</w:t>
     </w:r>
   </w:p>
 </w:hdr>
@@ -2430,11 +2186,11 @@
     <w:qFormat/>
     <w:rsid w:val="00FC693F"/>
     <w:pPr>
-      <w:spacing w:after="120" w:line="300" w:lineRule="auto"/>
+      <w:spacing w:after="100"/>
     </w:pPr>
     <w:rPr>
       <w:rFonts w:ascii="Calibri" w:hAnsi="Calibri" w:eastAsia="Microsoft YaHei"/>
-      <w:sz w:val="22"/>
+      <w:sz w:val="21"/>
     </w:rPr>
   </w:style>
   <w:style w:type="paragraph" w:styleId="Header">
@@ -2492,7 +2248,7 @@
     <w:pPr>
       <w:keepNext/>
       <w:keepLines/>
-      <w:spacing w:before="360" w:after="200"/>
+      <w:spacing w:before="280" w:after="140"/>
       <w:outlineLvl w:val="0"/>
     </w:pPr>
     <w:rPr>
@@ -2500,7 +2256,7 @@
       <w:b/>
       <w:bCs/>
       <w:color w:val="2E74B5"/>
-      <w:sz w:val="32"/>
+      <w:sz w:val="30"/>
       <w:szCs w:val="28"/>
     </w:rPr>
   </w:style>
@@ -2516,7 +2272,7 @@
     <w:pPr>
       <w:keepNext/>
       <w:keepLines/>
-      <w:spacing w:before="280" w:after="140"/>
+      <w:spacing w:before="200" w:after="100"/>
       <w:outlineLvl w:val="1"/>
     </w:pPr>
     <w:rPr>
@@ -2524,7 +2280,7 @@
       <w:b/>
       <w:bCs/>
       <w:color w:val="2E74B5"/>
-      <w:sz w:val="26"/>
+      <w:sz w:val="24"/>
       <w:szCs w:val="26"/>
     </w:rPr>
   </w:style>
@@ -2540,15 +2296,14 @@
     <w:pPr>
       <w:keepNext/>
       <w:keepLines/>
-      <w:spacing w:before="200" w:after="100"/>
+      <w:spacing w:before="200" w:after="0"/>
       <w:outlineLvl w:val="2"/>
     </w:pPr>
     <w:rPr>
-      <w:rFonts w:asciiTheme="majorHAnsi" w:eastAsiaTheme="majorEastAsia" w:hAnsiTheme="majorHAnsi" w:cstheme="majorBidi" w:ascii="Calibri" w:hAnsi="Calibri" w:eastAsia="Microsoft YaHei"/>
+      <w:rFonts w:asciiTheme="majorHAnsi" w:eastAsiaTheme="majorEastAsia" w:hAnsiTheme="majorHAnsi" w:cstheme="majorBidi"/>
       <w:b/>
       <w:bCs/>
-      <w:color w:val="1F4D78"/>
-      <w:sz w:val="24"/>
+      <w:color w:val="4F81BD" w:themeColor="accent1"/>
     </w:rPr>
   </w:style>
   <w:style w:type="paragraph" w:styleId="Heading4">

</xml_diff>